<commit_message>
Restyle lab 1 use case diagram to match reference layout
</commit_message>
<xml_diff>
--- a/PPO_LR1_Taxi/ЛР1_Такси_Требования.docx
+++ b/PPO_LR1_Taxi/ЛР1_Такси_Требования.docx
@@ -6147,7 +6147,7 @@
                 <w:b w:val="0"/>
                 <w:sz w:val="18"/>
               </w:rPr>
-              <w:t>docs/diagrams/use-cases.puml и use-cases.svg: руководитель (финансовый директор), граница и С1–С3</w:t>
+              <w:t>docs/diagrams/use-cases.puml и use-cases.svg: граница сайта, существующие действия клиента и С1–С3 руководителя (финансового директора)</w:t>
             </w:r>
           </w:p>
         </w:tc>
@@ -6256,7 +6256,7 @@
       <w:r>
         <w:drawing>
           <wp:inline xmlns:a="http://schemas.openxmlformats.org/drawingml/2006/main" xmlns:pic="http://schemas.openxmlformats.org/drawingml/2006/picture">
-            <wp:extent cx="5669280" cy="2826678"/>
+            <wp:extent cx="5669280" cy="4157472"/>
             <wp:docPr id="1" name="Picture 1"/>
             <wp:cNvGraphicFramePr>
               <a:graphicFrameLocks noChangeAspect="1"/>
@@ -6277,7 +6277,7 @@
                   <pic:spPr>
                     <a:xfrm>
                       <a:off x="0" y="0"/>
-                      <a:ext cx="5669280" cy="2826678"/>
+                      <a:ext cx="5669280" cy="4157472"/>
                     </a:xfrm>
                     <a:prstGeom prst="rect"/>
                   </pic:spPr>
@@ -6298,12 +6298,12 @@
     </w:p>
     <w:p>
       <w:r>
-        <w:t>Единственный актор — руководитель службы такси, выполняющий функции финансового директора. В границе модуля показаны С1 «Создать или изменить план и рассчитать прогноз», С2 «Сравнить два плана», С3 «Сохранить и открыть план». Ассоциации обозначают доступные действия пользователя. Классы, формулы, база данных и технические шаги не изображаются как пользовательские варианты использования.</w:t>
+        <w:t>Диаграмма показывает два уровня возможностей сайта. Клиент связан с существующими действиями: «Рассчитать стоимость поездки», «Создать заказ», «Просмотреть свои заказы». Руководитель (финансовый директор) связан с планируемым расширением: С1 «Создать или изменить план и рассчитать прогноз», С2 «Сравнить два плана», С3 «Сохранить и открыть план». Акторы расположены слева вне общей границы сайта, действия — внутри. Ассоциации обозначают доступные действия пользователя. Классы, формулы и база данных не изображаются как варианты использования.</w:t>
       </w:r>
     </w:p>
     <w:p>
       <w:r>
-        <w:t>Операционные действия клиента, диспетчера и водителя не входят в границу этой диаграммы: они остаются частью общего сайта, но не являются предметом финансовых сценариев ЛР1.</w:t>
+        <w:t>Клиентские действия показаны для контекста и не входят в финансовые сценарии С1–С3. Диспетчер и водитель опущены на этой обзорной диаграмме; их функции общего сайта не меняются. Единственный участник именно финансового модуля — руководитель. Верхняя группа помечена «Существующие функции», нижняя — «Планируемое расширение».</w:t>
       </w:r>
     </w:p>
     <w:p>

</xml_diff>